<commit_message>
SivaStuti Baraha work corr
</commit_message>
<xml_diff>
--- a/TS-Kramam/TS-4.5/TS 4.5 Sanskrit Krama Paatam Corrections.docx
+++ b/TS-Kramam/TS-4.5/TS 4.5 Sanskrit Krama Paatam Corrections.docx
@@ -81,7 +81,18 @@
           <w:szCs w:val="32"/>
           <w:u w:val="single"/>
         </w:rPr>
-        <w:t xml:space="preserve">Observed till </w:t>
+        <w:t xml:space="preserve">Observed </w:t>
+      </w:r>
+      <w:proofErr w:type="gramStart"/>
+      <w:r>
+        <w:rPr>
+          <w:b/>
+          <w:bCs/>
+          <w:sz w:val="32"/>
+          <w:szCs w:val="32"/>
+          <w:u w:val="single"/>
+        </w:rPr>
+        <w:t xml:space="preserve">till </w:t>
       </w:r>
       <w:r>
         <w:rPr>
@@ -94,6 +105,7 @@
         </w:rPr>
         <w:t>????</w:t>
       </w:r>
+      <w:proofErr w:type="gramEnd"/>
     </w:p>
     <w:p>
       <w:pPr>
@@ -141,12 +153,16 @@
               <w:spacing w:before="0" w:line="240" w:lineRule="auto"/>
               <w:jc w:val="center"/>
               <w:rPr>
+                <w:b/>
+                <w:bCs/>
                 <w:sz w:val="32"/>
                 <w:szCs w:val="32"/>
               </w:rPr>
             </w:pPr>
             <w:r>
               <w:rPr>
+                <w:b/>
+                <w:bCs/>
                 <w:sz w:val="32"/>
                 <w:szCs w:val="32"/>
               </w:rPr>
@@ -158,12 +174,16 @@
               <w:spacing w:before="0" w:line="240" w:lineRule="auto"/>
               <w:jc w:val="center"/>
               <w:rPr>
+                <w:b/>
+                <w:bCs/>
                 <w:sz w:val="32"/>
                 <w:szCs w:val="32"/>
               </w:rPr>
             </w:pPr>
             <w:r>
               <w:rPr>
+                <w:b/>
+                <w:bCs/>
                 <w:sz w:val="32"/>
                 <w:szCs w:val="32"/>
               </w:rPr>
@@ -180,12 +200,16 @@
               <w:spacing w:before="0" w:line="240" w:lineRule="auto"/>
               <w:jc w:val="center"/>
               <w:rPr>
+                <w:b/>
+                <w:bCs/>
                 <w:sz w:val="32"/>
                 <w:szCs w:val="32"/>
               </w:rPr>
             </w:pPr>
             <w:r>
               <w:rPr>
+                <w:b/>
+                <w:bCs/>
                 <w:sz w:val="32"/>
                 <w:szCs w:val="32"/>
               </w:rPr>
@@ -203,12 +227,16 @@
               <w:ind w:right="-18"/>
               <w:jc w:val="center"/>
               <w:rPr>
+                <w:b/>
+                <w:bCs/>
                 <w:sz w:val="32"/>
                 <w:szCs w:val="32"/>
               </w:rPr>
             </w:pPr>
             <w:r>
               <w:rPr>
+                <w:b/>
+                <w:bCs/>
                 <w:sz w:val="32"/>
                 <w:szCs w:val="32"/>
               </w:rPr>
@@ -1491,6 +1519,7 @@
                 <w:szCs w:val="40"/>
               </w:rPr>
             </w:pPr>
+            <w:proofErr w:type="spellStart"/>
             <w:r>
               <w:rPr>
                 <w:rFonts w:ascii="BRH Devanagari Extra" w:hAnsi="BRH Devanagari Extra" w:cs="BRH Devanagari Extra"/>
@@ -1510,6 +1539,7 @@
               </w:rPr>
               <w:t>kÉÏ</w:t>
             </w:r>
+            <w:proofErr w:type="spellEnd"/>
             <w:r>
               <w:rPr>
                 <w:rFonts w:ascii="BRH Malayalam Extra" w:hAnsi="BRH Malayalam Extra" w:cs="BRH Devanagari Extra"/>
@@ -1520,14 +1550,25 @@
               </w:rPr>
               <w:t>–</w:t>
             </w:r>
-            <w:r>
-              <w:rPr>
-                <w:rFonts w:ascii="BRH Devanagari Extra" w:hAnsi="BRH Devanagari Extra" w:cs="BRH Devanagari Extra"/>
-                <w:color w:val="000000"/>
-                <w:sz w:val="40"/>
-                <w:szCs w:val="40"/>
-              </w:rPr>
-              <w:t>irÉÍkÉþ ||</w:t>
+            <w:proofErr w:type="spellStart"/>
+            <w:r>
+              <w:rPr>
+                <w:rFonts w:ascii="BRH Devanagari Extra" w:hAnsi="BRH Devanagari Extra" w:cs="BRH Devanagari Extra"/>
+                <w:color w:val="000000"/>
+                <w:sz w:val="40"/>
+                <w:szCs w:val="40"/>
+              </w:rPr>
+              <w:t>irÉÍkÉþ</w:t>
+            </w:r>
+            <w:proofErr w:type="spellEnd"/>
+            <w:r>
+              <w:rPr>
+                <w:rFonts w:ascii="BRH Devanagari Extra" w:hAnsi="BRH Devanagari Extra" w:cs="BRH Devanagari Extra"/>
+                <w:color w:val="000000"/>
+                <w:sz w:val="40"/>
+                <w:szCs w:val="40"/>
+              </w:rPr>
+              <w:t xml:space="preserve"> ||</w:t>
             </w:r>
           </w:p>
         </w:tc>
@@ -1549,6 +1590,7 @@
                 <w:szCs w:val="40"/>
               </w:rPr>
             </w:pPr>
+            <w:proofErr w:type="spellStart"/>
             <w:r>
               <w:rPr>
                 <w:rFonts w:ascii="BRH Devanagari Extra" w:hAnsi="BRH Devanagari Extra" w:cs="BRH Devanagari Extra"/>
@@ -1575,7 +1617,17 @@
                 <w:sz w:val="40"/>
                 <w:szCs w:val="40"/>
               </w:rPr>
-              <w:t>irÉÍkÉþ ||</w:t>
+              <w:t>irÉÍkÉþ</w:t>
+            </w:r>
+            <w:proofErr w:type="spellEnd"/>
+            <w:r>
+              <w:rPr>
+                <w:rFonts w:ascii="BRH Devanagari Extra" w:hAnsi="BRH Devanagari Extra" w:cs="BRH Devanagari Extra"/>
+                <w:color w:val="000000"/>
+                <w:sz w:val="40"/>
+                <w:szCs w:val="40"/>
+              </w:rPr>
+              <w:t xml:space="preserve"> ||</w:t>
             </w:r>
           </w:p>
         </w:tc>
@@ -1638,7 +1690,10 @@
           <w:u w:val="single"/>
         </w:rPr>
       </w:pPr>
-      <w:r>
+    </w:p>
+    <w:p>
+      <w:pPr>
+        <w:jc w:val="center"/>
         <w:rPr>
           <w:b/>
           <w:bCs/>
@@ -1646,6 +1701,40 @@
           <w:szCs w:val="32"/>
           <w:u w:val="single"/>
         </w:rPr>
+      </w:pPr>
+    </w:p>
+    <w:p>
+      <w:pPr>
+        <w:jc w:val="center"/>
+        <w:rPr>
+          <w:b/>
+          <w:bCs/>
+          <w:sz w:val="32"/>
+          <w:szCs w:val="32"/>
+          <w:u w:val="single"/>
+        </w:rPr>
+      </w:pPr>
+    </w:p>
+    <w:p>
+      <w:pPr>
+        <w:jc w:val="center"/>
+        <w:rPr>
+          <w:b/>
+          <w:bCs/>
+          <w:sz w:val="32"/>
+          <w:szCs w:val="32"/>
+          <w:u w:val="single"/>
+        </w:rPr>
+      </w:pPr>
+      <w:r>
+        <w:rPr>
+          <w:b/>
+          <w:bCs/>
+          <w:sz w:val="32"/>
+          <w:szCs w:val="32"/>
+          <w:u w:val="single"/>
+        </w:rPr>
+        <w:lastRenderedPageBreak/>
         <w:t xml:space="preserve">TS </w:t>
       </w:r>
       <w:r>
@@ -1765,12 +1854,16 @@
               <w:spacing w:before="0" w:line="240" w:lineRule="auto"/>
               <w:jc w:val="center"/>
               <w:rPr>
+                <w:b/>
+                <w:bCs/>
                 <w:sz w:val="32"/>
                 <w:szCs w:val="32"/>
               </w:rPr>
             </w:pPr>
             <w:r>
               <w:rPr>
+                <w:b/>
+                <w:bCs/>
                 <w:sz w:val="32"/>
                 <w:szCs w:val="32"/>
               </w:rPr>
@@ -1782,12 +1875,16 @@
               <w:spacing w:before="0" w:line="240" w:lineRule="auto"/>
               <w:jc w:val="center"/>
               <w:rPr>
+                <w:b/>
+                <w:bCs/>
                 <w:sz w:val="32"/>
                 <w:szCs w:val="32"/>
               </w:rPr>
             </w:pPr>
             <w:r>
               <w:rPr>
+                <w:b/>
+                <w:bCs/>
                 <w:sz w:val="32"/>
                 <w:szCs w:val="32"/>
               </w:rPr>
@@ -1804,12 +1901,16 @@
               <w:spacing w:before="0" w:line="240" w:lineRule="auto"/>
               <w:jc w:val="center"/>
               <w:rPr>
+                <w:b/>
+                <w:bCs/>
                 <w:sz w:val="32"/>
                 <w:szCs w:val="32"/>
               </w:rPr>
             </w:pPr>
             <w:r>
               <w:rPr>
+                <w:b/>
+                <w:bCs/>
                 <w:sz w:val="32"/>
                 <w:szCs w:val="32"/>
               </w:rPr>
@@ -1827,12 +1928,16 @@
               <w:ind w:right="-18"/>
               <w:jc w:val="center"/>
               <w:rPr>
+                <w:b/>
+                <w:bCs/>
                 <w:sz w:val="32"/>
                 <w:szCs w:val="32"/>
               </w:rPr>
             </w:pPr>
             <w:r>
               <w:rPr>
+                <w:b/>
+                <w:bCs/>
                 <w:sz w:val="32"/>
                 <w:szCs w:val="32"/>
               </w:rPr>
@@ -1874,7 +1979,6 @@
                 <w:sz w:val="28"/>
                 <w:szCs w:val="32"/>
               </w:rPr>
-              <w:lastRenderedPageBreak/>
               <w:t>T.S.4.5.1</w:t>
             </w:r>
             <w:r>
@@ -1884,7 +1988,7 @@
                 <w:sz w:val="28"/>
                 <w:szCs w:val="32"/>
               </w:rPr>
-              <w:t>o</w:t>
+              <w:t>0</w:t>
             </w:r>
             <w:r>
               <w:rPr>
@@ -2080,7 +2184,47 @@
                 <w:sz w:val="40"/>
                 <w:szCs w:val="40"/>
               </w:rPr>
-              <w:t xml:space="preserve"> CÌiÉþ UÏËUwÉÈ ||</w:t>
+              <w:t xml:space="preserve"> </w:t>
+            </w:r>
+            <w:proofErr w:type="spellStart"/>
+            <w:r>
+              <w:rPr>
+                <w:rFonts w:ascii="BRH Devanagari Extra" w:hAnsi="BRH Devanagari Extra" w:cs="BRH Devanagari Extra"/>
+                <w:color w:val="000000"/>
+                <w:sz w:val="40"/>
+                <w:szCs w:val="40"/>
+              </w:rPr>
+              <w:t>CÌiÉþ</w:t>
+            </w:r>
+            <w:proofErr w:type="spellEnd"/>
+            <w:r>
+              <w:rPr>
+                <w:rFonts w:ascii="BRH Devanagari Extra" w:hAnsi="BRH Devanagari Extra" w:cs="BRH Devanagari Extra"/>
+                <w:color w:val="000000"/>
+                <w:sz w:val="40"/>
+                <w:szCs w:val="40"/>
+              </w:rPr>
+              <w:t xml:space="preserve"> </w:t>
+            </w:r>
+            <w:proofErr w:type="spellStart"/>
+            <w:r>
+              <w:rPr>
+                <w:rFonts w:ascii="BRH Devanagari Extra" w:hAnsi="BRH Devanagari Extra" w:cs="BRH Devanagari Extra"/>
+                <w:color w:val="000000"/>
+                <w:sz w:val="40"/>
+                <w:szCs w:val="40"/>
+              </w:rPr>
+              <w:t>UÏËUwÉÈ</w:t>
+            </w:r>
+            <w:proofErr w:type="spellEnd"/>
+            <w:r>
+              <w:rPr>
+                <w:rFonts w:ascii="BRH Devanagari Extra" w:hAnsi="BRH Devanagari Extra" w:cs="BRH Devanagari Extra"/>
+                <w:color w:val="000000"/>
+                <w:sz w:val="40"/>
+                <w:szCs w:val="40"/>
+              </w:rPr>
+              <w:t xml:space="preserve"> ||</w:t>
             </w:r>
           </w:p>
         </w:tc>
@@ -2164,7 +2308,47 @@
                 <w:sz w:val="40"/>
                 <w:szCs w:val="40"/>
               </w:rPr>
-              <w:t xml:space="preserve"> CÌiÉþ UÏËUwÉÈ ||</w:t>
+              <w:t xml:space="preserve"> </w:t>
+            </w:r>
+            <w:proofErr w:type="spellStart"/>
+            <w:r>
+              <w:rPr>
+                <w:rFonts w:ascii="BRH Devanagari Extra" w:hAnsi="BRH Devanagari Extra" w:cs="BRH Devanagari Extra"/>
+                <w:color w:val="000000"/>
+                <w:sz w:val="40"/>
+                <w:szCs w:val="40"/>
+              </w:rPr>
+              <w:t>CÌiÉþ</w:t>
+            </w:r>
+            <w:proofErr w:type="spellEnd"/>
+            <w:r>
+              <w:rPr>
+                <w:rFonts w:ascii="BRH Devanagari Extra" w:hAnsi="BRH Devanagari Extra" w:cs="BRH Devanagari Extra"/>
+                <w:color w:val="000000"/>
+                <w:sz w:val="40"/>
+                <w:szCs w:val="40"/>
+              </w:rPr>
+              <w:t xml:space="preserve"> </w:t>
+            </w:r>
+            <w:proofErr w:type="spellStart"/>
+            <w:r>
+              <w:rPr>
+                <w:rFonts w:ascii="BRH Devanagari Extra" w:hAnsi="BRH Devanagari Extra" w:cs="BRH Devanagari Extra"/>
+                <w:color w:val="000000"/>
+                <w:sz w:val="40"/>
+                <w:szCs w:val="40"/>
+              </w:rPr>
+              <w:t>UÏËUwÉÈ</w:t>
+            </w:r>
+            <w:proofErr w:type="spellEnd"/>
+            <w:r>
+              <w:rPr>
+                <w:rFonts w:ascii="BRH Devanagari Extra" w:hAnsi="BRH Devanagari Extra" w:cs="BRH Devanagari Extra"/>
+                <w:color w:val="000000"/>
+                <w:sz w:val="40"/>
+                <w:szCs w:val="40"/>
+              </w:rPr>
+              <w:t xml:space="preserve"> ||</w:t>
             </w:r>
           </w:p>
         </w:tc>
@@ -2372,12 +2556,16 @@
               <w:spacing w:before="0" w:line="240" w:lineRule="auto"/>
               <w:jc w:val="center"/>
               <w:rPr>
+                <w:b/>
+                <w:bCs/>
                 <w:sz w:val="32"/>
                 <w:szCs w:val="32"/>
               </w:rPr>
             </w:pPr>
             <w:r>
               <w:rPr>
+                <w:b/>
+                <w:bCs/>
                 <w:sz w:val="32"/>
                 <w:szCs w:val="32"/>
               </w:rPr>
@@ -2389,12 +2577,16 @@
               <w:spacing w:before="0" w:line="240" w:lineRule="auto"/>
               <w:jc w:val="center"/>
               <w:rPr>
+                <w:b/>
+                <w:bCs/>
                 <w:sz w:val="32"/>
                 <w:szCs w:val="32"/>
               </w:rPr>
             </w:pPr>
             <w:r>
               <w:rPr>
+                <w:b/>
+                <w:bCs/>
                 <w:sz w:val="32"/>
                 <w:szCs w:val="32"/>
               </w:rPr>
@@ -2411,12 +2603,16 @@
               <w:spacing w:before="0" w:line="240" w:lineRule="auto"/>
               <w:jc w:val="center"/>
               <w:rPr>
+                <w:b/>
+                <w:bCs/>
                 <w:sz w:val="32"/>
                 <w:szCs w:val="32"/>
               </w:rPr>
             </w:pPr>
             <w:r>
               <w:rPr>
+                <w:b/>
+                <w:bCs/>
                 <w:sz w:val="32"/>
                 <w:szCs w:val="32"/>
               </w:rPr>
@@ -2434,12 +2630,16 @@
               <w:ind w:right="-18"/>
               <w:jc w:val="center"/>
               <w:rPr>
+                <w:b/>
+                <w:bCs/>
                 <w:sz w:val="32"/>
                 <w:szCs w:val="32"/>
               </w:rPr>
             </w:pPr>
             <w:r>
               <w:rPr>
+                <w:b/>
+                <w:bCs/>
                 <w:sz w:val="32"/>
                 <w:szCs w:val="32"/>
               </w:rPr>
@@ -2577,6 +2777,7 @@
                 <w:szCs w:val="40"/>
               </w:rPr>
             </w:pPr>
+            <w:proofErr w:type="spellStart"/>
             <w:r>
               <w:rPr>
                 <w:rFonts w:ascii="BRH Devanagari Extra" w:hAnsi="BRH Devanagari Extra" w:cs="BRH Devanagari Extra"/>
@@ -2586,6 +2787,7 @@
               </w:rPr>
               <w:t>lÉÏsÉþaÉëÏuÉÉ</w:t>
             </w:r>
+            <w:proofErr w:type="spellEnd"/>
             <w:r>
               <w:rPr>
                 <w:rFonts w:ascii="BRH Malayalam Extra" w:hAnsi="BRH Malayalam Extra" w:cs="BRH Devanagari Extra"/>
@@ -2595,6 +2797,7 @@
               </w:rPr>
               <w:t>–</w:t>
             </w:r>
+            <w:proofErr w:type="spellStart"/>
             <w:r>
               <w:rPr>
                 <w:rFonts w:ascii="BRH Devanagari Extra" w:hAnsi="BRH Devanagari Extra" w:cs="BRH Devanagari Extra"/>
@@ -2604,6 +2807,7 @@
               </w:rPr>
               <w:t>rÉåÌiÉ</w:t>
             </w:r>
+            <w:proofErr w:type="spellEnd"/>
             <w:r>
               <w:rPr>
                 <w:rFonts w:ascii="BRH Malayalam Extra" w:hAnsi="BRH Malayalam Extra" w:cs="BRH Devanagari Extra"/>
@@ -2622,6 +2826,7 @@
               </w:rPr>
               <w:t xml:space="preserve"> </w:t>
             </w:r>
+            <w:proofErr w:type="spellStart"/>
             <w:r>
               <w:rPr>
                 <w:rFonts w:ascii="BRH Devanagari Extra" w:hAnsi="BRH Devanagari Extra" w:cs="BRH Devanagari Extra"/>
@@ -2639,8 +2844,29 @@
                 <w:sz w:val="40"/>
                 <w:szCs w:val="40"/>
               </w:rPr>
-              <w:t>sÉ - aÉëÏ</w:t>
-            </w:r>
+              <w:t>sÉ</w:t>
+            </w:r>
+            <w:proofErr w:type="spellEnd"/>
+            <w:r>
+              <w:rPr>
+                <w:rFonts w:ascii="BRH Devanagari Extra" w:hAnsi="BRH Devanagari Extra" w:cs="BRH Devanagari Extra"/>
+                <w:color w:val="000000"/>
+                <w:sz w:val="40"/>
+                <w:szCs w:val="40"/>
+              </w:rPr>
+              <w:t xml:space="preserve"> - </w:t>
+            </w:r>
+            <w:proofErr w:type="spellStart"/>
+            <w:r>
+              <w:rPr>
+                <w:rFonts w:ascii="BRH Devanagari Extra" w:hAnsi="BRH Devanagari Extra" w:cs="BRH Devanagari Extra"/>
+                <w:color w:val="000000"/>
+                <w:sz w:val="40"/>
+                <w:szCs w:val="40"/>
+              </w:rPr>
+              <w:t>aÉëÏ</w:t>
+            </w:r>
+            <w:proofErr w:type="spellEnd"/>
             <w:r>
               <w:rPr>
                 <w:rFonts w:ascii="BRH Malayalam Extra" w:hAnsi="BRH Malayalam Extra" w:cs="BRH Devanagari Extra"/>
@@ -2650,6 +2876,7 @@
               </w:rPr>
               <w:t>–</w:t>
             </w:r>
+            <w:proofErr w:type="spellStart"/>
             <w:r>
               <w:rPr>
                 <w:rFonts w:ascii="BRH Devanagari Extra" w:hAnsi="BRH Devanagari Extra" w:cs="BRH Devanagari Extra"/>
@@ -2659,6 +2886,7 @@
               </w:rPr>
               <w:t>uÉÉ</w:t>
             </w:r>
+            <w:proofErr w:type="spellEnd"/>
             <w:r>
               <w:rPr>
                 <w:rFonts w:ascii="BRH Malayalam Extra" w:hAnsi="BRH Malayalam Extra" w:cs="BRH Devanagari Extra"/>
@@ -2715,6 +2943,7 @@
                 <w:szCs w:val="40"/>
               </w:rPr>
             </w:pPr>
+            <w:proofErr w:type="spellStart"/>
             <w:r>
               <w:rPr>
                 <w:rFonts w:ascii="BRH Devanagari Extra" w:hAnsi="BRH Devanagari Extra" w:cs="BRH Devanagari Extra"/>
@@ -2724,6 +2953,7 @@
               </w:rPr>
               <w:t>lÉÏsÉþaÉëÏuÉÉ</w:t>
             </w:r>
+            <w:proofErr w:type="spellEnd"/>
             <w:r>
               <w:rPr>
                 <w:rFonts w:ascii="BRH Malayalam Extra" w:hAnsi="BRH Malayalam Extra" w:cs="BRH Devanagari Extra"/>
@@ -2733,6 +2963,7 @@
               </w:rPr>
               <w:t>–</w:t>
             </w:r>
+            <w:proofErr w:type="spellStart"/>
             <w:r>
               <w:rPr>
                 <w:rFonts w:ascii="BRH Devanagari Extra" w:hAnsi="BRH Devanagari Extra" w:cs="BRH Devanagari Extra"/>
@@ -2742,6 +2973,7 @@
               </w:rPr>
               <w:t>rÉåÌiÉ</w:t>
             </w:r>
+            <w:proofErr w:type="spellEnd"/>
             <w:r>
               <w:rPr>
                 <w:rFonts w:ascii="BRH Malayalam Extra" w:hAnsi="BRH Malayalam Extra" w:cs="BRH Devanagari Extra"/>
@@ -2758,7 +2990,17 @@
                 <w:sz w:val="40"/>
                 <w:szCs w:val="40"/>
               </w:rPr>
-              <w:t xml:space="preserve"> lÉÏ</w:t>
+              <w:t xml:space="preserve"> </w:t>
+            </w:r>
+            <w:proofErr w:type="spellStart"/>
+            <w:r>
+              <w:rPr>
+                <w:rFonts w:ascii="BRH Devanagari Extra" w:hAnsi="BRH Devanagari Extra" w:cs="BRH Devanagari Extra"/>
+                <w:color w:val="000000"/>
+                <w:sz w:val="40"/>
+                <w:szCs w:val="40"/>
+              </w:rPr>
+              <w:t>lÉÏ</w:t>
             </w:r>
             <w:r>
               <w:rPr>
@@ -2777,8 +3019,29 @@
                 <w:sz w:val="40"/>
                 <w:szCs w:val="40"/>
               </w:rPr>
-              <w:t>þ - aÉëÏ</w:t>
-            </w:r>
+              <w:t>þ</w:t>
+            </w:r>
+            <w:proofErr w:type="spellEnd"/>
+            <w:r>
+              <w:rPr>
+                <w:rFonts w:ascii="BRH Devanagari Extra" w:hAnsi="BRH Devanagari Extra" w:cs="BRH Devanagari Extra"/>
+                <w:color w:val="000000"/>
+                <w:sz w:val="40"/>
+                <w:szCs w:val="40"/>
+              </w:rPr>
+              <w:t xml:space="preserve"> - </w:t>
+            </w:r>
+            <w:proofErr w:type="spellStart"/>
+            <w:r>
+              <w:rPr>
+                <w:rFonts w:ascii="BRH Devanagari Extra" w:hAnsi="BRH Devanagari Extra" w:cs="BRH Devanagari Extra"/>
+                <w:color w:val="000000"/>
+                <w:sz w:val="40"/>
+                <w:szCs w:val="40"/>
+              </w:rPr>
+              <w:t>aÉëÏ</w:t>
+            </w:r>
+            <w:proofErr w:type="spellEnd"/>
             <w:r>
               <w:rPr>
                 <w:rFonts w:ascii="BRH Malayalam Extra" w:hAnsi="BRH Malayalam Extra" w:cs="BRH Devanagari Extra"/>
@@ -2788,6 +3051,7 @@
               </w:rPr>
               <w:t>–</w:t>
             </w:r>
+            <w:proofErr w:type="spellStart"/>
             <w:r>
               <w:rPr>
                 <w:rFonts w:ascii="BRH Devanagari Extra" w:hAnsi="BRH Devanagari Extra" w:cs="BRH Devanagari Extra"/>
@@ -2797,6 +3061,7 @@
               </w:rPr>
               <w:t>uÉÉ</w:t>
             </w:r>
+            <w:proofErr w:type="spellEnd"/>
             <w:r>
               <w:rPr>
                 <w:rFonts w:ascii="BRH Malayalam Extra" w:hAnsi="BRH Malayalam Extra" w:cs="BRH Devanagari Extra"/>
@@ -3031,6 +3296,7 @@
                 <w:szCs w:val="40"/>
               </w:rPr>
             </w:pPr>
+            <w:proofErr w:type="spellStart"/>
             <w:r>
               <w:rPr>
                 <w:rFonts w:ascii="BRH Devanagari Extra" w:hAnsi="BRH Devanagari Extra" w:cs="BRH Devanagari Extra"/>
@@ -3040,6 +3306,7 @@
               </w:rPr>
               <w:t>lÉqÉÉå</w:t>
             </w:r>
+            <w:proofErr w:type="spellEnd"/>
             <w:r>
               <w:rPr>
                 <w:rFonts w:ascii="BRH Malayalam Extra" w:hAnsi="BRH Malayalam Extra" w:cs="BRH Devanagari Extra"/>
@@ -3056,7 +3323,37 @@
                 <w:sz w:val="40"/>
                 <w:szCs w:val="40"/>
               </w:rPr>
-              <w:t xml:space="preserve"> lÉqÉþÈ | lÉ</w:t>
+              <w:t xml:space="preserve"> </w:t>
+            </w:r>
+            <w:proofErr w:type="spellStart"/>
+            <w:r>
+              <w:rPr>
+                <w:rFonts w:ascii="BRH Devanagari Extra" w:hAnsi="BRH Devanagari Extra" w:cs="BRH Devanagari Extra"/>
+                <w:color w:val="000000"/>
+                <w:sz w:val="40"/>
+                <w:szCs w:val="40"/>
+              </w:rPr>
+              <w:t>lÉqÉþÈ</w:t>
+            </w:r>
+            <w:proofErr w:type="spellEnd"/>
+            <w:r>
+              <w:rPr>
+                <w:rFonts w:ascii="BRH Devanagari Extra" w:hAnsi="BRH Devanagari Extra" w:cs="BRH Devanagari Extra"/>
+                <w:color w:val="000000"/>
+                <w:sz w:val="40"/>
+                <w:szCs w:val="40"/>
+              </w:rPr>
+              <w:t xml:space="preserve"> | </w:t>
+            </w:r>
+            <w:proofErr w:type="spellStart"/>
+            <w:r>
+              <w:rPr>
+                <w:rFonts w:ascii="BRH Devanagari Extra" w:hAnsi="BRH Devanagari Extra" w:cs="BRH Devanagari Extra"/>
+                <w:color w:val="000000"/>
+                <w:sz w:val="40"/>
+                <w:szCs w:val="40"/>
+              </w:rPr>
+              <w:t>lÉ</w:t>
             </w:r>
             <w:r>
               <w:rPr>
@@ -3068,6 +3365,7 @@
               </w:rPr>
               <w:t>qÉ</w:t>
             </w:r>
+            <w:proofErr w:type="spellEnd"/>
             <w:r>
               <w:rPr>
                 <w:rFonts w:ascii="BRH Malayalam Extra" w:hAnsi="BRH Malayalam Extra" w:cs="BRH Devanagari Extra"/>
@@ -3095,7 +3393,27 @@
                 <w:sz w:val="40"/>
                 <w:szCs w:val="40"/>
               </w:rPr>
-              <w:t xml:space="preserve"> CwÉÑþqÉSèprÉÈ |</w:t>
+              <w:t xml:space="preserve"> </w:t>
+            </w:r>
+            <w:proofErr w:type="spellStart"/>
+            <w:r>
+              <w:rPr>
+                <w:rFonts w:ascii="BRH Devanagari Extra" w:hAnsi="BRH Devanagari Extra" w:cs="BRH Devanagari Extra"/>
+                <w:color w:val="000000"/>
+                <w:sz w:val="40"/>
+                <w:szCs w:val="40"/>
+              </w:rPr>
+              <w:t>CwÉÑþqÉSèprÉÈ</w:t>
+            </w:r>
+            <w:proofErr w:type="spellEnd"/>
+            <w:r>
+              <w:rPr>
+                <w:rFonts w:ascii="BRH Devanagari Extra" w:hAnsi="BRH Devanagari Extra" w:cs="BRH Devanagari Extra"/>
+                <w:color w:val="000000"/>
+                <w:sz w:val="40"/>
+                <w:szCs w:val="40"/>
+              </w:rPr>
+              <w:t xml:space="preserve"> |</w:t>
             </w:r>
           </w:p>
         </w:tc>
@@ -3115,6 +3433,7 @@
                 <w:bCs/>
               </w:rPr>
             </w:pPr>
+            <w:proofErr w:type="spellStart"/>
             <w:r>
               <w:rPr>
                 <w:rFonts w:ascii="BRH Devanagari Extra" w:hAnsi="BRH Devanagari Extra" w:cs="BRH Devanagari Extra"/>
@@ -3124,6 +3443,7 @@
               </w:rPr>
               <w:t>lÉqÉÉå</w:t>
             </w:r>
+            <w:proofErr w:type="spellEnd"/>
             <w:r>
               <w:rPr>
                 <w:rFonts w:ascii="BRH Malayalam Extra" w:hAnsi="BRH Malayalam Extra" w:cs="BRH Devanagari Extra"/>
@@ -3140,7 +3460,37 @@
                 <w:sz w:val="40"/>
                 <w:szCs w:val="40"/>
               </w:rPr>
-              <w:t xml:space="preserve"> lÉqÉþÈ | lÉ</w:t>
+              <w:t xml:space="preserve"> </w:t>
+            </w:r>
+            <w:proofErr w:type="spellStart"/>
+            <w:r>
+              <w:rPr>
+                <w:rFonts w:ascii="BRH Devanagari Extra" w:hAnsi="BRH Devanagari Extra" w:cs="BRH Devanagari Extra"/>
+                <w:color w:val="000000"/>
+                <w:sz w:val="40"/>
+                <w:szCs w:val="40"/>
+              </w:rPr>
+              <w:t>lÉqÉþÈ</w:t>
+            </w:r>
+            <w:proofErr w:type="spellEnd"/>
+            <w:r>
+              <w:rPr>
+                <w:rFonts w:ascii="BRH Devanagari Extra" w:hAnsi="BRH Devanagari Extra" w:cs="BRH Devanagari Extra"/>
+                <w:color w:val="000000"/>
+                <w:sz w:val="40"/>
+                <w:szCs w:val="40"/>
+              </w:rPr>
+              <w:t xml:space="preserve"> | </w:t>
+            </w:r>
+            <w:proofErr w:type="spellStart"/>
+            <w:r>
+              <w:rPr>
+                <w:rFonts w:ascii="BRH Devanagari Extra" w:hAnsi="BRH Devanagari Extra" w:cs="BRH Devanagari Extra"/>
+                <w:color w:val="000000"/>
+                <w:sz w:val="40"/>
+                <w:szCs w:val="40"/>
+              </w:rPr>
+              <w:t>lÉ</w:t>
             </w:r>
             <w:r>
               <w:rPr>
@@ -3152,6 +3502,7 @@
               </w:rPr>
               <w:t>qÉ</w:t>
             </w:r>
+            <w:proofErr w:type="spellEnd"/>
             <w:r>
               <w:rPr>
                 <w:rFonts w:ascii="BRH Malayalam Extra" w:hAnsi="BRH Malayalam Extra" w:cs="BRH Devanagari Extra"/>
@@ -3169,7 +3520,27 @@
                 <w:sz w:val="40"/>
                 <w:szCs w:val="40"/>
               </w:rPr>
-              <w:t xml:space="preserve"> CwÉÑþqÉSèprÉÈ |</w:t>
+              <w:t xml:space="preserve"> </w:t>
+            </w:r>
+            <w:proofErr w:type="spellStart"/>
+            <w:r>
+              <w:rPr>
+                <w:rFonts w:ascii="BRH Devanagari Extra" w:hAnsi="BRH Devanagari Extra" w:cs="BRH Devanagari Extra"/>
+                <w:color w:val="000000"/>
+                <w:sz w:val="40"/>
+                <w:szCs w:val="40"/>
+              </w:rPr>
+              <w:t>CwÉÑþqÉSèprÉÈ</w:t>
+            </w:r>
+            <w:proofErr w:type="spellEnd"/>
+            <w:r>
+              <w:rPr>
+                <w:rFonts w:ascii="BRH Devanagari Extra" w:hAnsi="BRH Devanagari Extra" w:cs="BRH Devanagari Extra"/>
+                <w:color w:val="000000"/>
+                <w:sz w:val="40"/>
+                <w:szCs w:val="40"/>
+              </w:rPr>
+              <w:t xml:space="preserve"> |</w:t>
             </w:r>
             <w:r>
               <w:rPr>
@@ -3198,7 +3569,23 @@
                 <w:b/>
                 <w:bCs/>
               </w:rPr>
-              <w:t>(visargam removed)</w:t>
+              <w:t>(</w:t>
+            </w:r>
+            <w:proofErr w:type="spellStart"/>
+            <w:r>
+              <w:rPr>
+                <w:b/>
+                <w:bCs/>
+              </w:rPr>
+              <w:t>visargam</w:t>
+            </w:r>
+            <w:proofErr w:type="spellEnd"/>
+            <w:r>
+              <w:rPr>
+                <w:b/>
+                <w:bCs/>
+              </w:rPr>
+              <w:t xml:space="preserve"> removed)</w:t>
             </w:r>
           </w:p>
         </w:tc>
@@ -3415,8 +3802,19 @@
                 <w:sz w:val="40"/>
                 <w:szCs w:val="40"/>
               </w:rPr>
-              <w:t>µÉprÉ</w:t>
-            </w:r>
+              <w:t>µ</w:t>
+            </w:r>
+            <w:proofErr w:type="spellStart"/>
+            <w:r>
+              <w:rPr>
+                <w:rFonts w:ascii="BRH Devanagari Extra" w:hAnsi="BRH Devanagari Extra" w:cs="BRH Devanagari Extra"/>
+                <w:color w:val="000000"/>
+                <w:sz w:val="40"/>
+                <w:szCs w:val="40"/>
+              </w:rPr>
+              <w:t>ÉprÉ</w:t>
+            </w:r>
+            <w:proofErr w:type="spellEnd"/>
             <w:r>
               <w:rPr>
                 <w:rFonts w:ascii="BRH Malayalam Extra" w:hAnsi="BRH Malayalam Extra" w:cs="BRH Devanagari Extra"/>
@@ -3433,7 +3831,27 @@
                 <w:sz w:val="40"/>
                 <w:szCs w:val="40"/>
               </w:rPr>
-              <w:t xml:space="preserve">È µÉmÉþÌiÉprÉÈ | </w:t>
+              <w:t>È µ</w:t>
+            </w:r>
+            <w:proofErr w:type="spellStart"/>
+            <w:r>
+              <w:rPr>
+                <w:rFonts w:ascii="BRH Devanagari Extra" w:hAnsi="BRH Devanagari Extra" w:cs="BRH Devanagari Extra"/>
+                <w:color w:val="000000"/>
+                <w:sz w:val="40"/>
+                <w:szCs w:val="40"/>
+              </w:rPr>
+              <w:t>ÉmÉþÌiÉprÉÈ</w:t>
+            </w:r>
+            <w:proofErr w:type="spellEnd"/>
+            <w:r>
+              <w:rPr>
+                <w:rFonts w:ascii="BRH Devanagari Extra" w:hAnsi="BRH Devanagari Extra" w:cs="BRH Devanagari Extra"/>
+                <w:color w:val="000000"/>
+                <w:sz w:val="40"/>
+                <w:szCs w:val="40"/>
+              </w:rPr>
+              <w:t xml:space="preserve"> | </w:t>
             </w:r>
           </w:p>
           <w:p>
@@ -3457,7 +3875,17 @@
                 <w:sz w:val="40"/>
                 <w:szCs w:val="40"/>
               </w:rPr>
-              <w:t>µÉ</w:t>
+              <w:t>µ</w:t>
+            </w:r>
+            <w:proofErr w:type="spellStart"/>
+            <w:r>
+              <w:rPr>
+                <w:rFonts w:ascii="BRH Devanagari Extra" w:hAnsi="BRH Devanagari Extra" w:cs="BRH Devanagari Extra"/>
+                <w:color w:val="000000"/>
+                <w:sz w:val="40"/>
+                <w:szCs w:val="40"/>
+              </w:rPr>
+              <w:t>É</w:t>
             </w:r>
             <w:r>
               <w:rPr>
@@ -3469,6 +3897,7 @@
               </w:rPr>
               <w:t>prÉ</w:t>
             </w:r>
+            <w:proofErr w:type="spellEnd"/>
             <w:r>
               <w:rPr>
                 <w:rFonts w:ascii="BRH Malayalam Extra" w:hAnsi="BRH Malayalam Extra" w:cs="BRH Devanagari Extra"/>
@@ -3496,8 +3925,19 @@
                 <w:sz w:val="40"/>
                 <w:szCs w:val="40"/>
               </w:rPr>
-              <w:t xml:space="preserve"> CÌiÉ</w:t>
-            </w:r>
+              <w:t xml:space="preserve"> </w:t>
+            </w:r>
+            <w:proofErr w:type="spellStart"/>
+            <w:r>
+              <w:rPr>
+                <w:rFonts w:ascii="BRH Devanagari Extra" w:hAnsi="BRH Devanagari Extra" w:cs="BRH Devanagari Extra"/>
+                <w:color w:val="000000"/>
+                <w:sz w:val="40"/>
+                <w:szCs w:val="40"/>
+              </w:rPr>
+              <w:t>CÌiÉ</w:t>
+            </w:r>
+            <w:proofErr w:type="spellEnd"/>
             <w:r>
               <w:rPr>
                 <w:rFonts w:ascii="BRH Malayalam Extra" w:hAnsi="BRH Malayalam Extra" w:cs="BRH Devanagari Extra"/>
@@ -3561,8 +4001,19 @@
                 <w:sz w:val="40"/>
                 <w:szCs w:val="40"/>
               </w:rPr>
-              <w:t>µÉprÉ</w:t>
-            </w:r>
+              <w:t>µ</w:t>
+            </w:r>
+            <w:proofErr w:type="spellStart"/>
+            <w:r>
+              <w:rPr>
+                <w:rFonts w:ascii="BRH Devanagari Extra" w:hAnsi="BRH Devanagari Extra" w:cs="BRH Devanagari Extra"/>
+                <w:color w:val="000000"/>
+                <w:sz w:val="40"/>
+                <w:szCs w:val="40"/>
+              </w:rPr>
+              <w:t>ÉprÉ</w:t>
+            </w:r>
+            <w:proofErr w:type="spellEnd"/>
             <w:r>
               <w:rPr>
                 <w:rFonts w:ascii="BRH Malayalam Extra" w:hAnsi="BRH Malayalam Extra" w:cs="BRH Devanagari Extra"/>
@@ -3579,7 +4030,27 @@
                 <w:sz w:val="40"/>
                 <w:szCs w:val="40"/>
               </w:rPr>
-              <w:t xml:space="preserve">È µÉmÉþÌiÉprÉÈ | </w:t>
+              <w:t>È µ</w:t>
+            </w:r>
+            <w:proofErr w:type="spellStart"/>
+            <w:r>
+              <w:rPr>
+                <w:rFonts w:ascii="BRH Devanagari Extra" w:hAnsi="BRH Devanagari Extra" w:cs="BRH Devanagari Extra"/>
+                <w:color w:val="000000"/>
+                <w:sz w:val="40"/>
+                <w:szCs w:val="40"/>
+              </w:rPr>
+              <w:t>ÉmÉþÌiÉprÉÈ</w:t>
+            </w:r>
+            <w:proofErr w:type="spellEnd"/>
+            <w:r>
+              <w:rPr>
+                <w:rFonts w:ascii="BRH Devanagari Extra" w:hAnsi="BRH Devanagari Extra" w:cs="BRH Devanagari Extra"/>
+                <w:color w:val="000000"/>
+                <w:sz w:val="40"/>
+                <w:szCs w:val="40"/>
+              </w:rPr>
+              <w:t xml:space="preserve"> | </w:t>
             </w:r>
           </w:p>
           <w:p>
@@ -3603,7 +4074,17 @@
                 <w:sz w:val="40"/>
                 <w:szCs w:val="40"/>
               </w:rPr>
-              <w:t>µÉ</w:t>
+              <w:t>µ</w:t>
+            </w:r>
+            <w:proofErr w:type="spellStart"/>
+            <w:r>
+              <w:rPr>
+                <w:rFonts w:ascii="BRH Devanagari Extra" w:hAnsi="BRH Devanagari Extra" w:cs="BRH Devanagari Extra"/>
+                <w:color w:val="000000"/>
+                <w:sz w:val="40"/>
+                <w:szCs w:val="40"/>
+              </w:rPr>
+              <w:t>É</w:t>
             </w:r>
             <w:r>
               <w:rPr>
@@ -3615,6 +4096,7 @@
               </w:rPr>
               <w:t>prÉ</w:t>
             </w:r>
+            <w:proofErr w:type="spellEnd"/>
             <w:r>
               <w:rPr>
                 <w:rFonts w:ascii="BRH Malayalam Extra" w:hAnsi="BRH Malayalam Extra" w:cs="BRH Devanagari Extra"/>
@@ -3632,8 +4114,19 @@
                 <w:sz w:val="40"/>
                 <w:szCs w:val="40"/>
               </w:rPr>
-              <w:t xml:space="preserve"> CÌiÉ</w:t>
-            </w:r>
+              <w:t xml:space="preserve"> </w:t>
+            </w:r>
+            <w:proofErr w:type="spellStart"/>
+            <w:r>
+              <w:rPr>
+                <w:rFonts w:ascii="BRH Devanagari Extra" w:hAnsi="BRH Devanagari Extra" w:cs="BRH Devanagari Extra"/>
+                <w:color w:val="000000"/>
+                <w:sz w:val="40"/>
+                <w:szCs w:val="40"/>
+              </w:rPr>
+              <w:t>CÌiÉ</w:t>
+            </w:r>
+            <w:proofErr w:type="spellEnd"/>
             <w:r>
               <w:rPr>
                 <w:rFonts w:ascii="BRH Malayalam Extra" w:hAnsi="BRH Malayalam Extra" w:cs="BRH Devanagari Extra"/>
@@ -3670,12 +4163,29 @@
               </w:rPr>
               <w:t xml:space="preserve">È | </w:t>
             </w:r>
+            <w:proofErr w:type="spellStart"/>
             <w:r>
               <w:rPr>
                 <w:b/>
                 <w:bCs/>
               </w:rPr>
-              <w:t>visargam removed)</w:t>
+              <w:t>visargam</w:t>
+            </w:r>
+            <w:proofErr w:type="spellEnd"/>
+            <w:r>
+              <w:rPr>
+                <w:b/>
+                <w:bCs/>
+              </w:rPr>
+              <w:t xml:space="preserve"> </w:t>
+            </w:r>
+            <w:r>
+              <w:rPr>
+                <w:b/>
+                <w:bCs/>
+              </w:rPr>
+              <w:lastRenderedPageBreak/>
+              <w:t>removed)</w:t>
             </w:r>
           </w:p>
         </w:tc>
@@ -3709,15 +4219,47 @@
           <w:szCs w:val="40"/>
           <w:lang w:val="en-IN" w:eastAsia="en-IN"/>
         </w:rPr>
-        <w:t xml:space="preserve">"zlÉ" </w:t>
-      </w:r>
-      <w:r>
-        <w:rPr>
-          <w:b/>
-          <w:bCs/>
-          <w:sz w:val="32"/>
-        </w:rPr>
-        <w:t>replaced with</w:t>
+        <w:lastRenderedPageBreak/>
+        <w:t>"</w:t>
+      </w:r>
+      <w:proofErr w:type="spellStart"/>
+      <w:r>
+        <w:rPr>
+          <w:rFonts w:ascii="BRH Devanagari" w:hAnsi="BRH Devanagari" w:cs="BRH Devanagari"/>
+          <w:color w:val="000000"/>
+          <w:sz w:val="40"/>
+          <w:szCs w:val="40"/>
+          <w:lang w:val="en-IN" w:eastAsia="en-IN"/>
+        </w:rPr>
+        <w:t>zlÉ</w:t>
+      </w:r>
+      <w:proofErr w:type="spellEnd"/>
+      <w:r>
+        <w:rPr>
+          <w:rFonts w:ascii="BRH Devanagari" w:hAnsi="BRH Devanagari" w:cs="BRH Devanagari"/>
+          <w:color w:val="000000"/>
+          <w:sz w:val="40"/>
+          <w:szCs w:val="40"/>
+          <w:lang w:val="en-IN" w:eastAsia="en-IN"/>
+        </w:rPr>
+        <w:t xml:space="preserve">" </w:t>
+      </w:r>
+      <w:r>
+        <w:rPr>
+          <w:b/>
+          <w:bCs/>
+          <w:sz w:val="32"/>
+        </w:rPr>
+        <w:t xml:space="preserve">replaced </w:t>
+      </w:r>
+      <w:proofErr w:type="gramStart"/>
+      <w:r>
+        <w:rPr>
+          <w:b/>
+          <w:bCs/>
+          <w:sz w:val="32"/>
+        </w:rPr>
+        <w:t>with</w:t>
       </w:r>
       <w:r>
         <w:rPr>
@@ -3739,6 +4281,8 @@
         </w:rPr>
         <w:t>"</w:t>
       </w:r>
+      <w:proofErr w:type="spellStart"/>
+      <w:proofErr w:type="gramEnd"/>
       <w:r>
         <w:rPr>
           <w:rFonts w:ascii="BRH Devanagari" w:hAnsi="BRH Devanagari" w:cs="BRH Devanagari"/>
@@ -3750,6 +4294,7 @@
         </w:rPr>
         <w:t>zgÉ</w:t>
       </w:r>
+      <w:proofErr w:type="spellEnd"/>
       <w:r>
         <w:rPr>
           <w:rFonts w:ascii="BRH Devanagari" w:hAnsi="BRH Devanagari" w:cs="BRH Devanagari"/>

</xml_diff>